<commit_message>
Primeiros passos em grid layout
</commit_message>
<xml_diff>
--- a/Aulas em pdf/notas-CURSO-HTML-CSS.docx
+++ b/Aulas em pdf/notas-CURSO-HTML-CSS.docx
@@ -3227,20 +3227,7 @@
           <w:szCs w:val="24"/>
           <w:lang w:val="pt-PT"/>
         </w:rPr>
-        <w:t xml:space="preserve">- </w:t>
-      </w:r>
-      <w:r>
-        <w:rPr>
-          <w:rFonts w:hint="default" w:ascii="Arial" w:hAnsi="Arial" w:cs="Arial"/>
-          <w:b w:val="0"/>
-          <w:bCs w:val="0"/>
-          <w:i w:val="0"/>
-          <w:iCs w:val="0"/>
-          <w:sz w:val="24"/>
-          <w:szCs w:val="24"/>
-          <w:lang w:val="pt-PT"/>
-        </w:rPr>
-        <w:t>Alinha os item no inico(cross-start) do eixo transversal(cross-axis) sem estica-lo mantendo o seus tamanho original;</w:t>
+        <w:t>- Alinha os item no inico(cross-start) do eixo transversal(cross-axis) sem estica-lo mantendo o seus tamanho original;</w:t>
       </w:r>
     </w:p>
     <w:p>
@@ -3366,6 +3353,7 @@
         <w:keepLines w:val="0"/>
         <w:widowControl/>
         <w:numPr>
+          <w:ilvl w:val="0"/>
           <w:numId w:val="0"/>
         </w:numPr>
         <w:suppressLineNumbers w:val="0"/>
@@ -3414,6 +3402,7 @@
         <w:keepLines w:val="0"/>
         <w:widowControl/>
         <w:numPr>
+          <w:ilvl w:val="0"/>
           <w:numId w:val="0"/>
         </w:numPr>
         <w:suppressLineNumbers w:val="0"/>
@@ -3482,22 +3471,7 @@
           <w:szCs w:val="24"/>
           <w:lang w:val="pt-PT"/>
         </w:rPr>
-        <w:t>: define o tamnho inicial de um item antes que o espaço restante do con</w:t>
-      </w:r>
-      <w:bookmarkStart w:id="0" w:name="_GoBack"/>
-      <w:bookmarkEnd w:id="0"/>
-      <w:r>
-        <w:rPr>
-          <w:rFonts w:hint="default" w:ascii="Arial" w:hAnsi="Arial" w:cs="Arial"/>
-          <w:b w:val="0"/>
-          <w:bCs w:val="0"/>
-          <w:i w:val="0"/>
-          <w:iCs w:val="0"/>
-          <w:sz w:val="24"/>
-          <w:szCs w:val="24"/>
-          <w:lang w:val="pt-PT"/>
-        </w:rPr>
-        <w:t>têiner seja distrbuido via flex-grow ou flex-shrink:</w:t>
+        <w:t>: define o tamnho inicial de um item antes que o espaço restante do contêiner seja distrbuido via flex-grow ou flex-shrink:</w:t>
       </w:r>
     </w:p>
     <w:p>
@@ -4064,6 +4038,7 @@
         <w:keepLines w:val="0"/>
         <w:widowControl/>
         <w:numPr>
+          <w:ilvl w:val="0"/>
           <w:numId w:val="0"/>
         </w:numPr>
         <w:suppressLineNumbers w:val="0"/>
@@ -4114,6 +4089,7 @@
         <w:keepLines w:val="0"/>
         <w:widowControl/>
         <w:numPr>
+          <w:ilvl w:val="0"/>
           <w:numId w:val="0"/>
         </w:numPr>
         <w:suppressLineNumbers w:val="0"/>
@@ -4560,6 +4536,7 @@
         <w:keepLines w:val="0"/>
         <w:widowControl/>
         <w:numPr>
+          <w:ilvl w:val="0"/>
           <w:numId w:val="0"/>
         </w:numPr>
         <w:suppressLineNumbers w:val="0"/>
@@ -4927,6 +4904,1278 @@
         </w:rPr>
         <w:t>- é o mesmo que flex: numero 1 auto.</w:t>
       </w:r>
+    </w:p>
+    <w:p>
+      <w:pPr>
+        <w:keepNext w:val="0"/>
+        <w:keepLines w:val="0"/>
+        <w:widowControl/>
+        <w:numPr>
+          <w:numId w:val="0"/>
+        </w:numPr>
+        <w:suppressLineNumbers w:val="0"/>
+        <w:spacing w:line="360" w:lineRule="auto"/>
+        <w:jc w:val="both"/>
+        <w:rPr>
+          <w:rFonts w:hint="default" w:ascii="Arial" w:hAnsi="Arial" w:cs="Arial"/>
+          <w:b w:val="0"/>
+          <w:bCs w:val="0"/>
+          <w:i w:val="0"/>
+          <w:iCs w:val="0"/>
+          <w:sz w:val="24"/>
+          <w:szCs w:val="24"/>
+          <w:lang w:val="pt-PT"/>
+        </w:rPr>
+      </w:pPr>
+    </w:p>
+    <w:p>
+      <w:pPr>
+        <w:keepNext w:val="0"/>
+        <w:keepLines w:val="0"/>
+        <w:widowControl/>
+        <w:numPr>
+          <w:numId w:val="0"/>
+        </w:numPr>
+        <w:suppressLineNumbers w:val="0"/>
+        <w:spacing w:line="360" w:lineRule="auto"/>
+        <w:jc w:val="both"/>
+        <w:rPr>
+          <w:rFonts w:hint="default" w:ascii="Arial" w:hAnsi="Arial" w:cs="Arial"/>
+          <w:b w:val="0"/>
+          <w:bCs w:val="0"/>
+          <w:i w:val="0"/>
+          <w:iCs w:val="0"/>
+          <w:sz w:val="24"/>
+          <w:szCs w:val="24"/>
+          <w:lang w:val="pt-PT"/>
+        </w:rPr>
+      </w:pPr>
+    </w:p>
+    <w:p>
+      <w:pPr>
+        <w:keepNext w:val="0"/>
+        <w:keepLines w:val="0"/>
+        <w:widowControl/>
+        <w:numPr>
+          <w:numId w:val="0"/>
+        </w:numPr>
+        <w:suppressLineNumbers w:val="0"/>
+        <w:spacing w:line="360" w:lineRule="auto"/>
+        <w:jc w:val="both"/>
+        <w:rPr>
+          <w:rFonts w:hint="default" w:ascii="Arial" w:hAnsi="Arial" w:cs="Arial"/>
+          <w:b w:val="0"/>
+          <w:bCs w:val="0"/>
+          <w:i w:val="0"/>
+          <w:iCs w:val="0"/>
+          <w:sz w:val="24"/>
+          <w:szCs w:val="24"/>
+          <w:lang w:val="pt-PT"/>
+        </w:rPr>
+      </w:pPr>
+      <w:r>
+        <w:rPr>
+          <w:rFonts w:hint="default" w:ascii="Arial" w:hAnsi="Arial" w:cs="Arial"/>
+          <w:b/>
+          <w:bCs/>
+          <w:i w:val="0"/>
+          <w:iCs w:val="0"/>
+          <w:sz w:val="24"/>
+          <w:szCs w:val="24"/>
+          <w:lang w:val="pt-PT"/>
+        </w:rPr>
+        <w:t>O que é Grid layout?</w:t>
+      </w:r>
+    </w:p>
+    <w:p>
+      <w:pPr>
+        <w:keepNext w:val="0"/>
+        <w:keepLines w:val="0"/>
+        <w:widowControl/>
+        <w:numPr>
+          <w:numId w:val="0"/>
+        </w:numPr>
+        <w:suppressLineNumbers w:val="0"/>
+        <w:spacing w:line="360" w:lineRule="auto"/>
+        <w:jc w:val="both"/>
+        <w:rPr>
+          <w:rFonts w:hint="default" w:ascii="Arial" w:hAnsi="Arial" w:cs="Arial"/>
+          <w:b w:val="0"/>
+          <w:bCs w:val="0"/>
+          <w:i w:val="0"/>
+          <w:iCs w:val="0"/>
+          <w:sz w:val="24"/>
+          <w:szCs w:val="24"/>
+          <w:lang w:val="pt-PT"/>
+        </w:rPr>
+      </w:pPr>
+      <w:r>
+        <w:rPr>
+          <w:rFonts w:hint="default" w:ascii="Arial" w:hAnsi="Arial" w:cs="Arial"/>
+          <w:b w:val="0"/>
+          <w:bCs w:val="0"/>
+          <w:i w:val="0"/>
+          <w:iCs w:val="0"/>
+          <w:sz w:val="24"/>
+          <w:szCs w:val="24"/>
+          <w:lang w:val="pt-PT"/>
+        </w:rPr>
+        <w:t>È um sistema de layout bidimensional nativo do css, projectado para organizar elementos em linhas e colunas simultaneamente.</w:t>
+      </w:r>
+    </w:p>
+    <w:p>
+      <w:pPr>
+        <w:keepNext w:val="0"/>
+        <w:keepLines w:val="0"/>
+        <w:widowControl/>
+        <w:numPr>
+          <w:numId w:val="0"/>
+        </w:numPr>
+        <w:suppressLineNumbers w:val="0"/>
+        <w:spacing w:line="360" w:lineRule="auto"/>
+        <w:jc w:val="both"/>
+        <w:rPr>
+          <w:rFonts w:hint="default" w:ascii="Arial" w:hAnsi="Arial" w:cs="Arial"/>
+          <w:b w:val="0"/>
+          <w:bCs w:val="0"/>
+          <w:i w:val="0"/>
+          <w:iCs w:val="0"/>
+          <w:sz w:val="24"/>
+          <w:szCs w:val="24"/>
+          <w:lang w:val="pt-PT"/>
+        </w:rPr>
+      </w:pPr>
+    </w:p>
+    <w:p>
+      <w:pPr>
+        <w:keepNext w:val="0"/>
+        <w:keepLines w:val="0"/>
+        <w:widowControl/>
+        <w:numPr>
+          <w:numId w:val="0"/>
+        </w:numPr>
+        <w:suppressLineNumbers w:val="0"/>
+        <w:spacing w:line="360" w:lineRule="auto"/>
+        <w:jc w:val="center"/>
+        <w:rPr>
+          <w:rFonts w:hint="default" w:ascii="Arial" w:hAnsi="Arial" w:cs="Arial"/>
+          <w:b w:val="0"/>
+          <w:bCs w:val="0"/>
+          <w:i w:val="0"/>
+          <w:iCs w:val="0"/>
+          <w:sz w:val="24"/>
+          <w:szCs w:val="24"/>
+          <w:lang w:val="pt-PT"/>
+        </w:rPr>
+      </w:pPr>
+      <w:r>
+        <w:rPr>
+          <w:rFonts w:hint="default" w:ascii="Arial" w:hAnsi="Arial" w:cs="Arial"/>
+          <w:b/>
+          <w:bCs/>
+          <w:i w:val="0"/>
+          <w:iCs w:val="0"/>
+          <w:sz w:val="24"/>
+          <w:szCs w:val="24"/>
+          <w:lang w:val="pt-PT"/>
+        </w:rPr>
+        <w:t>Anatomia do Grid</w:t>
+      </w:r>
+    </w:p>
+    <w:p>
+      <w:pPr>
+        <w:keepNext w:val="0"/>
+        <w:keepLines w:val="0"/>
+        <w:widowControl/>
+        <w:numPr>
+          <w:ilvl w:val="0"/>
+          <w:numId w:val="23"/>
+        </w:numPr>
+        <w:suppressLineNumbers w:val="0"/>
+        <w:tabs>
+          <w:tab w:val="clear" w:pos="425"/>
+        </w:tabs>
+        <w:spacing w:line="360" w:lineRule="auto"/>
+        <w:ind w:left="425" w:leftChars="0" w:hanging="425" w:firstLineChars="0"/>
+        <w:jc w:val="left"/>
+        <w:rPr>
+          <w:rFonts w:hint="default" w:ascii="Arial" w:hAnsi="Arial" w:cs="Arial"/>
+          <w:b w:val="0"/>
+          <w:bCs w:val="0"/>
+          <w:i w:val="0"/>
+          <w:iCs w:val="0"/>
+          <w:sz w:val="24"/>
+          <w:szCs w:val="24"/>
+          <w:lang w:val="pt-PT"/>
+        </w:rPr>
+      </w:pPr>
+      <w:r>
+        <w:rPr>
+          <w:rFonts w:hint="default" w:ascii="Arial" w:hAnsi="Arial" w:cs="Arial"/>
+          <w:b/>
+          <w:bCs/>
+          <w:i w:val="0"/>
+          <w:iCs w:val="0"/>
+          <w:sz w:val="24"/>
+          <w:szCs w:val="24"/>
+          <w:lang w:val="pt-PT"/>
+        </w:rPr>
+        <w:t>Contêiner (Grid Container):</w:t>
+      </w:r>
+    </w:p>
+    <w:p>
+      <w:pPr>
+        <w:keepNext w:val="0"/>
+        <w:keepLines w:val="0"/>
+        <w:widowControl/>
+        <w:numPr>
+          <w:ilvl w:val="-4"/>
+          <w:numId w:val="0"/>
+        </w:numPr>
+        <w:suppressLineNumbers w:val="0"/>
+        <w:spacing w:line="360" w:lineRule="auto"/>
+        <w:ind w:left="720" w:leftChars="0"/>
+        <w:jc w:val="left"/>
+        <w:rPr>
+          <w:rFonts w:hint="default" w:ascii="Arial" w:hAnsi="Arial" w:cs="Arial"/>
+          <w:b w:val="0"/>
+          <w:bCs w:val="0"/>
+          <w:i w:val="0"/>
+          <w:iCs w:val="0"/>
+          <w:sz w:val="24"/>
+          <w:szCs w:val="24"/>
+          <w:lang w:val="pt-PT"/>
+        </w:rPr>
+      </w:pPr>
+      <w:r>
+        <w:rPr>
+          <w:rFonts w:hint="default" w:ascii="Arial" w:hAnsi="Arial" w:cs="Arial"/>
+          <w:b w:val="0"/>
+          <w:bCs w:val="0"/>
+          <w:i w:val="0"/>
+          <w:iCs w:val="0"/>
+          <w:sz w:val="24"/>
+          <w:szCs w:val="24"/>
+          <w:lang w:val="pt-PT"/>
+        </w:rPr>
+        <w:t>A caixa pai que envolve os elementos.</w:t>
+      </w:r>
+    </w:p>
+    <w:p>
+      <w:pPr>
+        <w:keepNext w:val="0"/>
+        <w:keepLines w:val="0"/>
+        <w:widowControl/>
+        <w:numPr>
+          <w:ilvl w:val="0"/>
+          <w:numId w:val="23"/>
+        </w:numPr>
+        <w:suppressLineNumbers w:val="0"/>
+        <w:tabs>
+          <w:tab w:val="clear" w:pos="425"/>
+        </w:tabs>
+        <w:spacing w:line="360" w:lineRule="auto"/>
+        <w:ind w:left="425" w:leftChars="0" w:hanging="425" w:firstLineChars="0"/>
+        <w:jc w:val="left"/>
+        <w:rPr>
+          <w:rFonts w:hint="default" w:ascii="Arial" w:hAnsi="Arial" w:cs="Arial"/>
+          <w:b w:val="0"/>
+          <w:bCs w:val="0"/>
+          <w:i w:val="0"/>
+          <w:iCs w:val="0"/>
+          <w:sz w:val="24"/>
+          <w:szCs w:val="24"/>
+          <w:lang w:val="pt-PT"/>
+        </w:rPr>
+      </w:pPr>
+      <w:r>
+        <w:rPr>
+          <w:rFonts w:hint="default" w:ascii="Arial" w:hAnsi="Arial" w:cs="Arial"/>
+          <w:b/>
+          <w:bCs/>
+          <w:i w:val="0"/>
+          <w:iCs w:val="0"/>
+          <w:sz w:val="24"/>
+          <w:szCs w:val="24"/>
+          <w:lang w:val="pt-PT"/>
+        </w:rPr>
+        <w:t>Itens do Grid (Grid Items):</w:t>
+      </w:r>
+    </w:p>
+    <w:p>
+      <w:pPr>
+        <w:keepNext w:val="0"/>
+        <w:keepLines w:val="0"/>
+        <w:widowControl/>
+        <w:numPr>
+          <w:numId w:val="0"/>
+        </w:numPr>
+        <w:suppressLineNumbers w:val="0"/>
+        <w:spacing w:line="360" w:lineRule="auto"/>
+        <w:ind w:left="720" w:leftChars="0"/>
+        <w:jc w:val="left"/>
+        <w:rPr>
+          <w:rFonts w:hint="default" w:ascii="Arial" w:hAnsi="Arial" w:cs="Arial"/>
+          <w:b w:val="0"/>
+          <w:bCs w:val="0"/>
+          <w:i w:val="0"/>
+          <w:iCs w:val="0"/>
+          <w:sz w:val="24"/>
+          <w:szCs w:val="24"/>
+          <w:lang w:val="pt-PT"/>
+        </w:rPr>
+      </w:pPr>
+      <w:r>
+        <w:rPr>
+          <w:rFonts w:hint="default" w:ascii="Arial" w:hAnsi="Arial" w:cs="Arial"/>
+          <w:b w:val="0"/>
+          <w:bCs w:val="0"/>
+          <w:i w:val="0"/>
+          <w:iCs w:val="0"/>
+          <w:sz w:val="24"/>
+          <w:szCs w:val="24"/>
+          <w:lang w:val="pt-PT"/>
+        </w:rPr>
+        <w:t>Filhos ditecto do contêiner.</w:t>
+      </w:r>
+    </w:p>
+    <w:p>
+      <w:pPr>
+        <w:keepNext w:val="0"/>
+        <w:keepLines w:val="0"/>
+        <w:widowControl/>
+        <w:numPr>
+          <w:ilvl w:val="0"/>
+          <w:numId w:val="23"/>
+        </w:numPr>
+        <w:suppressLineNumbers w:val="0"/>
+        <w:tabs>
+          <w:tab w:val="clear" w:pos="425"/>
+        </w:tabs>
+        <w:spacing w:line="360" w:lineRule="auto"/>
+        <w:ind w:left="425" w:leftChars="0" w:hanging="425" w:firstLineChars="0"/>
+        <w:jc w:val="left"/>
+        <w:rPr>
+          <w:rFonts w:hint="default" w:ascii="Arial" w:hAnsi="Arial" w:cs="Arial"/>
+          <w:b w:val="0"/>
+          <w:bCs w:val="0"/>
+          <w:i w:val="0"/>
+          <w:iCs w:val="0"/>
+          <w:sz w:val="24"/>
+          <w:szCs w:val="24"/>
+          <w:lang w:val="pt-PT"/>
+        </w:rPr>
+      </w:pPr>
+      <w:r>
+        <w:rPr>
+          <w:rFonts w:hint="default" w:ascii="Arial" w:hAnsi="Arial" w:cs="Arial"/>
+          <w:b/>
+          <w:bCs/>
+          <w:i w:val="0"/>
+          <w:iCs w:val="0"/>
+          <w:sz w:val="24"/>
+          <w:szCs w:val="24"/>
+          <w:lang w:val="pt-PT"/>
+        </w:rPr>
+        <w:t>Linhas e colunas(Tracks):</w:t>
+      </w:r>
+    </w:p>
+    <w:p>
+      <w:pPr>
+        <w:keepNext w:val="0"/>
+        <w:keepLines w:val="0"/>
+        <w:widowControl/>
+        <w:numPr>
+          <w:ilvl w:val="0"/>
+          <w:numId w:val="24"/>
+        </w:numPr>
+        <w:suppressLineNumbers w:val="0"/>
+        <w:tabs>
+          <w:tab w:val="clear" w:pos="840"/>
+        </w:tabs>
+        <w:spacing w:line="360" w:lineRule="auto"/>
+        <w:ind w:left="840" w:leftChars="0" w:hanging="420" w:firstLineChars="0"/>
+        <w:jc w:val="left"/>
+        <w:rPr>
+          <w:rFonts w:hint="default" w:ascii="Arial" w:hAnsi="Arial" w:cs="Arial"/>
+          <w:b w:val="0"/>
+          <w:bCs w:val="0"/>
+          <w:i w:val="0"/>
+          <w:iCs w:val="0"/>
+          <w:sz w:val="24"/>
+          <w:szCs w:val="24"/>
+          <w:lang w:val="pt-PT"/>
+        </w:rPr>
+      </w:pPr>
+      <w:r>
+        <w:rPr>
+          <w:rFonts w:hint="default" w:ascii="Arial" w:hAnsi="Arial" w:cs="Arial"/>
+          <w:b/>
+          <w:bCs/>
+          <w:i w:val="0"/>
+          <w:iCs w:val="0"/>
+          <w:sz w:val="24"/>
+          <w:szCs w:val="24"/>
+          <w:lang w:val="pt-PT"/>
+        </w:rPr>
+        <w:t>row tracks</w:t>
+      </w:r>
+      <w:r>
+        <w:rPr>
+          <w:rFonts w:hint="default" w:ascii="Arial" w:hAnsi="Arial" w:cs="Arial"/>
+          <w:b w:val="0"/>
+          <w:bCs w:val="0"/>
+          <w:i w:val="0"/>
+          <w:iCs w:val="0"/>
+          <w:sz w:val="24"/>
+          <w:szCs w:val="24"/>
+          <w:lang w:val="pt-PT"/>
+        </w:rPr>
+        <w:t xml:space="preserve"> - Define linhas;</w:t>
+      </w:r>
+    </w:p>
+    <w:p>
+      <w:pPr>
+        <w:keepNext w:val="0"/>
+        <w:keepLines w:val="0"/>
+        <w:widowControl/>
+        <w:numPr>
+          <w:ilvl w:val="0"/>
+          <w:numId w:val="24"/>
+        </w:numPr>
+        <w:suppressLineNumbers w:val="0"/>
+        <w:tabs>
+          <w:tab w:val="clear" w:pos="840"/>
+        </w:tabs>
+        <w:spacing w:line="360" w:lineRule="auto"/>
+        <w:ind w:left="840" w:leftChars="0" w:hanging="420" w:firstLineChars="0"/>
+        <w:jc w:val="left"/>
+        <w:rPr>
+          <w:rFonts w:hint="default" w:ascii="Arial" w:hAnsi="Arial" w:cs="Arial"/>
+          <w:b w:val="0"/>
+          <w:bCs w:val="0"/>
+          <w:i w:val="0"/>
+          <w:iCs w:val="0"/>
+          <w:sz w:val="24"/>
+          <w:szCs w:val="24"/>
+          <w:lang w:val="pt-PT"/>
+        </w:rPr>
+      </w:pPr>
+      <w:r>
+        <w:rPr>
+          <w:rFonts w:hint="default" w:ascii="Arial" w:hAnsi="Arial" w:cs="Arial"/>
+          <w:b/>
+          <w:bCs/>
+          <w:i w:val="0"/>
+          <w:iCs w:val="0"/>
+          <w:sz w:val="24"/>
+          <w:szCs w:val="24"/>
+          <w:lang w:val="pt-PT"/>
+        </w:rPr>
+        <w:t xml:space="preserve">column tracks </w:t>
+      </w:r>
+      <w:r>
+        <w:rPr>
+          <w:rFonts w:hint="default" w:ascii="Arial" w:hAnsi="Arial" w:cs="Arial"/>
+          <w:b w:val="0"/>
+          <w:bCs w:val="0"/>
+          <w:i w:val="0"/>
+          <w:iCs w:val="0"/>
+          <w:sz w:val="24"/>
+          <w:szCs w:val="24"/>
+          <w:lang w:val="pt-PT"/>
+        </w:rPr>
+        <w:t>- Define as colunas.</w:t>
+      </w:r>
+    </w:p>
+    <w:p>
+      <w:pPr>
+        <w:keepNext w:val="0"/>
+        <w:keepLines w:val="0"/>
+        <w:widowControl/>
+        <w:numPr>
+          <w:numId w:val="0"/>
+        </w:numPr>
+        <w:suppressLineNumbers w:val="0"/>
+        <w:spacing w:line="360" w:lineRule="auto"/>
+        <w:jc w:val="left"/>
+        <w:rPr>
+          <w:rFonts w:hint="default" w:ascii="Arial" w:hAnsi="Arial" w:cs="Arial"/>
+          <w:b w:val="0"/>
+          <w:bCs w:val="0"/>
+          <w:i w:val="0"/>
+          <w:iCs w:val="0"/>
+          <w:sz w:val="24"/>
+          <w:szCs w:val="24"/>
+          <w:lang w:val="pt-PT"/>
+        </w:rPr>
+      </w:pPr>
+    </w:p>
+    <w:p>
+      <w:pPr>
+        <w:keepNext w:val="0"/>
+        <w:keepLines w:val="0"/>
+        <w:widowControl/>
+        <w:numPr>
+          <w:ilvl w:val="0"/>
+          <w:numId w:val="25"/>
+        </w:numPr>
+        <w:suppressLineNumbers w:val="0"/>
+        <w:spacing w:line="360" w:lineRule="auto"/>
+        <w:ind w:left="432" w:leftChars="0" w:hanging="432" w:firstLineChars="0"/>
+        <w:jc w:val="left"/>
+        <w:rPr>
+          <w:rFonts w:hint="default" w:ascii="Arial" w:hAnsi="Arial" w:cs="Arial"/>
+          <w:b w:val="0"/>
+          <w:bCs w:val="0"/>
+          <w:i w:val="0"/>
+          <w:iCs w:val="0"/>
+          <w:sz w:val="24"/>
+          <w:szCs w:val="24"/>
+          <w:lang w:val="pt-PT"/>
+        </w:rPr>
+      </w:pPr>
+      <w:r>
+        <w:rPr>
+          <w:rFonts w:hint="default" w:ascii="Arial" w:hAnsi="Arial" w:cs="Arial"/>
+          <w:b/>
+          <w:bCs/>
+          <w:i w:val="0"/>
+          <w:iCs w:val="0"/>
+          <w:sz w:val="24"/>
+          <w:szCs w:val="24"/>
+          <w:lang w:val="pt-PT"/>
+        </w:rPr>
+        <w:t>Grid Lines:</w:t>
+      </w:r>
+    </w:p>
+    <w:p>
+      <w:pPr>
+        <w:keepNext w:val="0"/>
+        <w:keepLines w:val="0"/>
+        <w:widowControl/>
+        <w:numPr>
+          <w:numId w:val="0"/>
+        </w:numPr>
+        <w:suppressLineNumbers w:val="0"/>
+        <w:spacing w:line="360" w:lineRule="auto"/>
+        <w:ind w:left="720" w:leftChars="0"/>
+        <w:jc w:val="left"/>
+        <w:rPr>
+          <w:rFonts w:hint="default" w:ascii="Arial" w:hAnsi="Arial" w:cs="Arial"/>
+          <w:b w:val="0"/>
+          <w:bCs w:val="0"/>
+          <w:i w:val="0"/>
+          <w:iCs w:val="0"/>
+          <w:sz w:val="24"/>
+          <w:szCs w:val="24"/>
+          <w:lang w:val="pt-PT"/>
+        </w:rPr>
+      </w:pPr>
+      <w:r>
+        <w:rPr>
+          <w:rFonts w:hint="default" w:ascii="Arial" w:hAnsi="Arial" w:cs="Arial"/>
+          <w:b w:val="0"/>
+          <w:bCs w:val="0"/>
+          <w:i w:val="0"/>
+          <w:iCs w:val="0"/>
+          <w:sz w:val="24"/>
+          <w:szCs w:val="24"/>
+          <w:lang w:val="pt-PT"/>
+        </w:rPr>
+        <w:t>Definem as linhas verticais e horizontais do contêiner.</w:t>
+      </w:r>
+    </w:p>
+    <w:p>
+      <w:pPr>
+        <w:keepNext w:val="0"/>
+        <w:keepLines w:val="0"/>
+        <w:widowControl/>
+        <w:numPr>
+          <w:ilvl w:val="0"/>
+          <w:numId w:val="25"/>
+        </w:numPr>
+        <w:suppressLineNumbers w:val="0"/>
+        <w:spacing w:line="360" w:lineRule="auto"/>
+        <w:ind w:left="432" w:leftChars="0" w:hanging="432" w:firstLineChars="0"/>
+        <w:jc w:val="left"/>
+        <w:rPr>
+          <w:rFonts w:hint="default" w:ascii="Arial" w:hAnsi="Arial" w:cs="Arial"/>
+          <w:b w:val="0"/>
+          <w:bCs w:val="0"/>
+          <w:i w:val="0"/>
+          <w:iCs w:val="0"/>
+          <w:sz w:val="24"/>
+          <w:szCs w:val="24"/>
+          <w:lang w:val="pt-PT"/>
+        </w:rPr>
+      </w:pPr>
+      <w:r>
+        <w:rPr>
+          <w:rFonts w:hint="default" w:ascii="Arial" w:hAnsi="Arial" w:cs="Arial"/>
+          <w:b/>
+          <w:bCs/>
+          <w:i w:val="0"/>
+          <w:iCs w:val="0"/>
+          <w:sz w:val="24"/>
+          <w:szCs w:val="24"/>
+          <w:lang w:val="pt-PT"/>
+        </w:rPr>
+        <w:t>Espaçamento (Gap):</w:t>
+      </w:r>
+    </w:p>
+    <w:p>
+      <w:pPr>
+        <w:keepNext w:val="0"/>
+        <w:keepLines w:val="0"/>
+        <w:widowControl/>
+        <w:numPr>
+          <w:numId w:val="0"/>
+        </w:numPr>
+        <w:suppressLineNumbers w:val="0"/>
+        <w:spacing w:line="360" w:lineRule="auto"/>
+        <w:ind w:left="720" w:leftChars="0"/>
+        <w:jc w:val="left"/>
+        <w:rPr>
+          <w:rFonts w:hint="default" w:ascii="Arial" w:hAnsi="Arial" w:cs="Arial"/>
+          <w:b w:val="0"/>
+          <w:bCs w:val="0"/>
+          <w:i w:val="0"/>
+          <w:iCs w:val="0"/>
+          <w:sz w:val="24"/>
+          <w:szCs w:val="24"/>
+          <w:lang w:val="pt-PT"/>
+        </w:rPr>
+      </w:pPr>
+      <w:r>
+        <w:rPr>
+          <w:rFonts w:hint="default" w:ascii="Arial" w:hAnsi="Arial" w:cs="Arial"/>
+          <w:b w:val="0"/>
+          <w:bCs w:val="0"/>
+          <w:i w:val="0"/>
+          <w:iCs w:val="0"/>
+          <w:sz w:val="24"/>
+          <w:szCs w:val="24"/>
+          <w:lang w:val="pt-PT"/>
+        </w:rPr>
+        <w:t>Define o espaçamento entre linhas e colunas.</w:t>
+      </w:r>
+    </w:p>
+    <w:p>
+      <w:pPr>
+        <w:keepNext w:val="0"/>
+        <w:keepLines w:val="0"/>
+        <w:widowControl/>
+        <w:numPr>
+          <w:numId w:val="0"/>
+        </w:numPr>
+        <w:suppressLineNumbers w:val="0"/>
+        <w:spacing w:line="360" w:lineRule="auto"/>
+        <w:jc w:val="left"/>
+        <w:rPr>
+          <w:rFonts w:hint="default" w:ascii="Arial" w:hAnsi="Arial" w:cs="Arial"/>
+          <w:b w:val="0"/>
+          <w:bCs w:val="0"/>
+          <w:i w:val="0"/>
+          <w:iCs w:val="0"/>
+          <w:sz w:val="24"/>
+          <w:szCs w:val="24"/>
+          <w:lang w:val="pt-PT"/>
+        </w:rPr>
+      </w:pPr>
+    </w:p>
+    <w:p>
+      <w:pPr>
+        <w:keepNext w:val="0"/>
+        <w:keepLines w:val="0"/>
+        <w:widowControl/>
+        <w:numPr>
+          <w:numId w:val="0"/>
+        </w:numPr>
+        <w:suppressLineNumbers w:val="0"/>
+        <w:spacing w:line="360" w:lineRule="auto"/>
+        <w:jc w:val="center"/>
+        <w:rPr>
+          <w:rFonts w:hint="default" w:ascii="Arial" w:hAnsi="Arial" w:cs="Arial"/>
+          <w:b/>
+          <w:bCs/>
+          <w:i w:val="0"/>
+          <w:iCs w:val="0"/>
+          <w:sz w:val="24"/>
+          <w:szCs w:val="24"/>
+          <w:lang w:val="pt-PT"/>
+        </w:rPr>
+      </w:pPr>
+      <w:r>
+        <w:rPr>
+          <w:rFonts w:hint="default" w:ascii="Arial" w:hAnsi="Arial" w:cs="Arial"/>
+          <w:b/>
+          <w:bCs/>
+          <w:i w:val="0"/>
+          <w:iCs w:val="0"/>
+          <w:sz w:val="24"/>
+          <w:szCs w:val="24"/>
+          <w:lang w:val="pt-PT"/>
+        </w:rPr>
+        <w:t>Propriedades de container do Grid Layout</w:t>
+      </w:r>
+    </w:p>
+    <w:p>
+      <w:pPr>
+        <w:keepNext w:val="0"/>
+        <w:keepLines w:val="0"/>
+        <w:widowControl/>
+        <w:numPr>
+          <w:ilvl w:val="0"/>
+          <w:numId w:val="26"/>
+        </w:numPr>
+        <w:suppressLineNumbers w:val="0"/>
+        <w:spacing w:line="360" w:lineRule="auto"/>
+        <w:ind w:left="420" w:leftChars="0" w:hanging="420" w:firstLineChars="0"/>
+        <w:jc w:val="left"/>
+        <w:rPr>
+          <w:rFonts w:hint="default" w:ascii="Arial" w:hAnsi="Arial" w:cs="Arial"/>
+          <w:b w:val="0"/>
+          <w:bCs w:val="0"/>
+          <w:i w:val="0"/>
+          <w:iCs w:val="0"/>
+          <w:sz w:val="24"/>
+          <w:szCs w:val="24"/>
+          <w:lang w:val="pt-PT"/>
+        </w:rPr>
+      </w:pPr>
+      <w:r>
+        <w:rPr>
+          <w:rFonts w:hint="default" w:ascii="Arial" w:hAnsi="Arial" w:cs="Arial"/>
+          <w:b/>
+          <w:bCs/>
+          <w:i w:val="0"/>
+          <w:iCs w:val="0"/>
+          <w:sz w:val="24"/>
+          <w:szCs w:val="24"/>
+          <w:lang w:val="pt-PT"/>
+        </w:rPr>
+        <w:t>display</w:t>
+      </w:r>
+      <w:r>
+        <w:rPr>
+          <w:rFonts w:hint="default" w:ascii="Arial" w:hAnsi="Arial" w:cs="Arial"/>
+          <w:b w:val="0"/>
+          <w:bCs w:val="0"/>
+          <w:i w:val="0"/>
+          <w:iCs w:val="0"/>
+          <w:sz w:val="24"/>
+          <w:szCs w:val="24"/>
+          <w:lang w:val="pt-PT"/>
+        </w:rPr>
+        <w:t xml:space="preserve"> - Activa o grid no contêiner, assume o seguinte valor:</w:t>
+      </w:r>
+    </w:p>
+    <w:p>
+      <w:pPr>
+        <w:keepNext w:val="0"/>
+        <w:keepLines w:val="0"/>
+        <w:widowControl/>
+        <w:numPr>
+          <w:ilvl w:val="0"/>
+          <w:numId w:val="27"/>
+        </w:numPr>
+        <w:suppressLineNumbers w:val="0"/>
+        <w:spacing w:line="360" w:lineRule="auto"/>
+        <w:ind w:left="845" w:leftChars="0" w:hanging="425" w:firstLineChars="0"/>
+        <w:jc w:val="left"/>
+        <w:rPr>
+          <w:rFonts w:hint="default" w:ascii="Arial" w:hAnsi="Arial" w:cs="Arial"/>
+          <w:b w:val="0"/>
+          <w:bCs w:val="0"/>
+          <w:i w:val="0"/>
+          <w:iCs w:val="0"/>
+          <w:sz w:val="24"/>
+          <w:szCs w:val="24"/>
+          <w:lang w:val="pt-PT"/>
+        </w:rPr>
+      </w:pPr>
+      <w:r>
+        <w:rPr>
+          <w:rFonts w:hint="default" w:ascii="Arial" w:hAnsi="Arial" w:cs="Arial"/>
+          <w:b/>
+          <w:bCs/>
+          <w:i w:val="0"/>
+          <w:iCs w:val="0"/>
+          <w:sz w:val="24"/>
+          <w:szCs w:val="24"/>
+          <w:lang w:val="pt-PT"/>
+        </w:rPr>
+        <w:t>grid</w:t>
+      </w:r>
+    </w:p>
+    <w:p>
+      <w:pPr>
+        <w:keepNext w:val="0"/>
+        <w:keepLines w:val="0"/>
+        <w:widowControl/>
+        <w:numPr>
+          <w:numId w:val="0"/>
+        </w:numPr>
+        <w:suppressLineNumbers w:val="0"/>
+        <w:spacing w:line="360" w:lineRule="auto"/>
+        <w:ind w:left="420" w:leftChars="0"/>
+        <w:jc w:val="left"/>
+        <w:rPr>
+          <w:rFonts w:hint="default" w:ascii="Arial" w:hAnsi="Arial" w:cs="Arial"/>
+          <w:b w:val="0"/>
+          <w:bCs w:val="0"/>
+          <w:i/>
+          <w:iCs/>
+          <w:sz w:val="24"/>
+          <w:szCs w:val="24"/>
+          <w:lang w:val="pt-PT"/>
+        </w:rPr>
+      </w:pPr>
+      <w:r>
+        <w:rPr>
+          <w:rFonts w:hint="default" w:ascii="Arial" w:hAnsi="Arial" w:cs="Arial"/>
+          <w:b/>
+          <w:bCs/>
+          <w:i w:val="0"/>
+          <w:iCs w:val="0"/>
+          <w:sz w:val="24"/>
+          <w:szCs w:val="24"/>
+          <w:lang w:val="pt-PT"/>
+        </w:rPr>
+        <w:t xml:space="preserve">Ex: </w:t>
+      </w:r>
+      <w:r>
+        <w:rPr>
+          <w:rFonts w:hint="default" w:ascii="Arial" w:hAnsi="Arial" w:cs="Arial"/>
+          <w:b w:val="0"/>
+          <w:bCs w:val="0"/>
+          <w:i/>
+          <w:iCs/>
+          <w:sz w:val="24"/>
+          <w:szCs w:val="24"/>
+          <w:lang w:val="pt-PT"/>
+        </w:rPr>
+        <w:t>display: grid;</w:t>
+      </w:r>
+    </w:p>
+    <w:p>
+      <w:pPr>
+        <w:keepNext w:val="0"/>
+        <w:keepLines w:val="0"/>
+        <w:widowControl/>
+        <w:numPr>
+          <w:numId w:val="0"/>
+        </w:numPr>
+        <w:suppressLineNumbers w:val="0"/>
+        <w:spacing w:line="360" w:lineRule="auto"/>
+        <w:ind w:left="420" w:leftChars="0"/>
+        <w:jc w:val="left"/>
+        <w:rPr>
+          <w:rFonts w:hint="default" w:ascii="Arial" w:hAnsi="Arial" w:cs="Arial"/>
+          <w:b w:val="0"/>
+          <w:bCs w:val="0"/>
+          <w:i/>
+          <w:iCs/>
+          <w:sz w:val="24"/>
+          <w:szCs w:val="24"/>
+          <w:lang w:val="pt-PT"/>
+        </w:rPr>
+      </w:pPr>
+    </w:p>
+    <w:p>
+      <w:pPr>
+        <w:keepNext w:val="0"/>
+        <w:keepLines w:val="0"/>
+        <w:widowControl/>
+        <w:numPr>
+          <w:ilvl w:val="0"/>
+          <w:numId w:val="28"/>
+        </w:numPr>
+        <w:suppressLineNumbers w:val="0"/>
+        <w:spacing w:line="360" w:lineRule="auto"/>
+        <w:ind w:left="420" w:leftChars="0" w:hanging="420" w:firstLineChars="0"/>
+        <w:jc w:val="left"/>
+        <w:rPr>
+          <w:rFonts w:hint="default" w:ascii="Arial" w:hAnsi="Arial" w:cs="Arial"/>
+          <w:b w:val="0"/>
+          <w:bCs w:val="0"/>
+          <w:i w:val="0"/>
+          <w:iCs w:val="0"/>
+          <w:sz w:val="24"/>
+          <w:szCs w:val="24"/>
+          <w:lang w:val="pt-PT"/>
+        </w:rPr>
+      </w:pPr>
+      <w:r>
+        <w:rPr>
+          <w:rFonts w:hint="default" w:ascii="Arial" w:hAnsi="Arial" w:cs="Arial"/>
+          <w:b/>
+          <w:bCs/>
+          <w:i w:val="0"/>
+          <w:iCs w:val="0"/>
+          <w:sz w:val="24"/>
+          <w:szCs w:val="24"/>
+          <w:lang w:val="pt-PT"/>
+        </w:rPr>
+        <w:t xml:space="preserve">grid-template-rows </w:t>
+      </w:r>
+      <w:r>
+        <w:rPr>
+          <w:rFonts w:hint="default" w:ascii="Arial" w:hAnsi="Arial" w:cs="Arial"/>
+          <w:b w:val="0"/>
+          <w:bCs w:val="0"/>
+          <w:i w:val="0"/>
+          <w:iCs w:val="0"/>
+          <w:sz w:val="24"/>
+          <w:szCs w:val="24"/>
+          <w:lang w:val="pt-PT"/>
+        </w:rPr>
+        <w:t>- Define o número de linhas do contêiner, assume os seguintes valores:</w:t>
+      </w:r>
+    </w:p>
+    <w:p>
+      <w:pPr>
+        <w:keepNext w:val="0"/>
+        <w:keepLines w:val="0"/>
+        <w:widowControl/>
+        <w:numPr>
+          <w:ilvl w:val="0"/>
+          <w:numId w:val="29"/>
+        </w:numPr>
+        <w:suppressLineNumbers w:val="0"/>
+        <w:spacing w:line="360" w:lineRule="auto"/>
+        <w:ind w:left="845" w:leftChars="0" w:hanging="425" w:firstLineChars="0"/>
+        <w:jc w:val="left"/>
+        <w:rPr>
+          <w:rFonts w:hint="default" w:ascii="Arial" w:hAnsi="Arial" w:cs="Arial"/>
+          <w:b w:val="0"/>
+          <w:bCs w:val="0"/>
+          <w:i w:val="0"/>
+          <w:iCs w:val="0"/>
+          <w:sz w:val="24"/>
+          <w:szCs w:val="24"/>
+          <w:lang w:val="pt-PT"/>
+        </w:rPr>
+      </w:pPr>
+      <w:r>
+        <w:rPr>
+          <w:rFonts w:hint="default" w:ascii="Arial" w:hAnsi="Arial" w:cs="Arial"/>
+          <w:b/>
+          <w:bCs/>
+          <w:i w:val="0"/>
+          <w:iCs w:val="0"/>
+          <w:sz w:val="24"/>
+          <w:szCs w:val="24"/>
+          <w:lang w:val="pt-PT"/>
+        </w:rPr>
+        <w:t xml:space="preserve">auto </w:t>
+      </w:r>
+      <w:r>
+        <w:rPr>
+          <w:rFonts w:hint="default" w:ascii="Arial" w:hAnsi="Arial" w:cs="Arial"/>
+          <w:b w:val="0"/>
+          <w:bCs w:val="0"/>
+          <w:i w:val="0"/>
+          <w:iCs w:val="0"/>
+          <w:sz w:val="24"/>
+          <w:szCs w:val="24"/>
+          <w:lang w:val="pt-PT"/>
+        </w:rPr>
+        <w:t>- O tamanho da  linha é determinado pelo conteúdo do item;</w:t>
+      </w:r>
+    </w:p>
+    <w:p>
+      <w:pPr>
+        <w:keepNext w:val="0"/>
+        <w:keepLines w:val="0"/>
+        <w:widowControl/>
+        <w:numPr>
+          <w:ilvl w:val="0"/>
+          <w:numId w:val="29"/>
+        </w:numPr>
+        <w:suppressLineNumbers w:val="0"/>
+        <w:spacing w:line="360" w:lineRule="auto"/>
+        <w:ind w:left="845" w:leftChars="0" w:hanging="425" w:firstLineChars="0"/>
+        <w:jc w:val="left"/>
+        <w:rPr>
+          <w:rFonts w:hint="default" w:ascii="Arial" w:hAnsi="Arial" w:cs="Arial"/>
+          <w:b w:val="0"/>
+          <w:bCs w:val="0"/>
+          <w:i w:val="0"/>
+          <w:iCs w:val="0"/>
+          <w:sz w:val="24"/>
+          <w:szCs w:val="24"/>
+          <w:lang w:val="pt-PT"/>
+        </w:rPr>
+      </w:pPr>
+      <w:r>
+        <w:rPr>
+          <w:rFonts w:hint="default" w:ascii="Arial" w:hAnsi="Arial" w:cs="Arial"/>
+          <w:b/>
+          <w:bCs/>
+          <w:i w:val="0"/>
+          <w:iCs w:val="0"/>
+          <w:sz w:val="24"/>
+          <w:szCs w:val="24"/>
+          <w:lang w:val="pt-PT"/>
+        </w:rPr>
+        <w:t>Valores de comprimento absoluto:</w:t>
+      </w:r>
+      <w:r>
+        <w:rPr>
+          <w:rFonts w:hint="default" w:ascii="Arial" w:hAnsi="Arial" w:cs="Arial"/>
+          <w:b w:val="0"/>
+          <w:bCs w:val="0"/>
+          <w:i w:val="0"/>
+          <w:iCs w:val="0"/>
+          <w:sz w:val="24"/>
+          <w:szCs w:val="24"/>
+          <w:lang w:val="pt-PT"/>
+        </w:rPr>
+        <w:t xml:space="preserve"> px, em, rem e etc;</w:t>
+      </w:r>
+    </w:p>
+    <w:p>
+      <w:pPr>
+        <w:keepNext w:val="0"/>
+        <w:keepLines w:val="0"/>
+        <w:widowControl/>
+        <w:numPr>
+          <w:ilvl w:val="0"/>
+          <w:numId w:val="29"/>
+        </w:numPr>
+        <w:suppressLineNumbers w:val="0"/>
+        <w:spacing w:line="360" w:lineRule="auto"/>
+        <w:ind w:left="845" w:leftChars="0" w:hanging="425" w:firstLineChars="0"/>
+        <w:jc w:val="left"/>
+        <w:rPr>
+          <w:rFonts w:hint="default" w:ascii="Arial" w:hAnsi="Arial" w:cs="Arial"/>
+          <w:b w:val="0"/>
+          <w:bCs w:val="0"/>
+          <w:i w:val="0"/>
+          <w:iCs w:val="0"/>
+          <w:sz w:val="24"/>
+          <w:szCs w:val="24"/>
+          <w:lang w:val="pt-PT"/>
+        </w:rPr>
+      </w:pPr>
+      <w:r>
+        <w:rPr>
+          <w:rFonts w:hint="default" w:ascii="Arial" w:hAnsi="Arial" w:cs="Arial"/>
+          <w:b/>
+          <w:bCs/>
+          <w:i w:val="0"/>
+          <w:iCs w:val="0"/>
+          <w:sz w:val="24"/>
+          <w:szCs w:val="24"/>
+          <w:lang w:val="pt-PT"/>
+        </w:rPr>
+        <w:t xml:space="preserve">Percentagens(%): </w:t>
+      </w:r>
+      <w:r>
+        <w:rPr>
+          <w:rFonts w:hint="default" w:ascii="Arial" w:hAnsi="Arial" w:cs="Arial"/>
+          <w:b w:val="0"/>
+          <w:bCs w:val="0"/>
+          <w:i w:val="0"/>
+          <w:iCs w:val="0"/>
+          <w:sz w:val="24"/>
+          <w:szCs w:val="24"/>
+          <w:lang w:val="pt-PT"/>
+        </w:rPr>
+        <w:t>relativa ao tamanho do contêiner da grade;</w:t>
+      </w:r>
+    </w:p>
+    <w:p>
+      <w:pPr>
+        <w:keepNext w:val="0"/>
+        <w:keepLines w:val="0"/>
+        <w:widowControl/>
+        <w:numPr>
+          <w:ilvl w:val="0"/>
+          <w:numId w:val="29"/>
+        </w:numPr>
+        <w:suppressLineNumbers w:val="0"/>
+        <w:spacing w:line="360" w:lineRule="auto"/>
+        <w:ind w:left="845" w:leftChars="0" w:hanging="425" w:firstLineChars="0"/>
+        <w:jc w:val="left"/>
+        <w:rPr>
+          <w:rFonts w:hint="default" w:ascii="Arial" w:hAnsi="Arial" w:cs="Arial"/>
+          <w:b w:val="0"/>
+          <w:bCs w:val="0"/>
+          <w:i w:val="0"/>
+          <w:iCs w:val="0"/>
+          <w:sz w:val="24"/>
+          <w:szCs w:val="24"/>
+          <w:lang w:val="pt-PT"/>
+        </w:rPr>
+      </w:pPr>
+      <w:r>
+        <w:rPr>
+          <w:rFonts w:hint="default" w:ascii="Arial" w:hAnsi="Arial" w:cs="Arial"/>
+          <w:b/>
+          <w:bCs/>
+          <w:i w:val="0"/>
+          <w:iCs w:val="0"/>
+          <w:sz w:val="24"/>
+          <w:szCs w:val="24"/>
+          <w:lang w:val="pt-PT"/>
+        </w:rPr>
+        <w:t xml:space="preserve">Unidade flexivel (fr): </w:t>
+      </w:r>
+      <w:r>
+        <w:rPr>
+          <w:rFonts w:hint="default" w:ascii="Arial" w:hAnsi="Arial" w:cs="Arial"/>
+          <w:b w:val="0"/>
+          <w:bCs w:val="0"/>
+          <w:i w:val="0"/>
+          <w:iCs w:val="0"/>
+          <w:sz w:val="24"/>
+          <w:szCs w:val="24"/>
+          <w:lang w:val="pt-PT"/>
+        </w:rPr>
+        <w:t>uma unidade de espaço fracionário que destribui o espaço restante proporcionalmente;</w:t>
+      </w:r>
+    </w:p>
+    <w:p>
+      <w:pPr>
+        <w:keepNext w:val="0"/>
+        <w:keepLines w:val="0"/>
+        <w:widowControl/>
+        <w:numPr>
+          <w:ilvl w:val="0"/>
+          <w:numId w:val="29"/>
+        </w:numPr>
+        <w:suppressLineNumbers w:val="0"/>
+        <w:spacing w:line="360" w:lineRule="auto"/>
+        <w:ind w:left="845" w:leftChars="0" w:hanging="425" w:firstLineChars="0"/>
+        <w:jc w:val="left"/>
+        <w:rPr>
+          <w:rFonts w:hint="default" w:ascii="Arial" w:hAnsi="Arial" w:cs="Arial"/>
+          <w:b w:val="0"/>
+          <w:bCs w:val="0"/>
+          <w:i w:val="0"/>
+          <w:iCs w:val="0"/>
+          <w:sz w:val="24"/>
+          <w:szCs w:val="24"/>
+          <w:lang w:val="pt-PT"/>
+        </w:rPr>
+      </w:pPr>
+      <w:r>
+        <w:rPr>
+          <w:rFonts w:hint="default" w:ascii="Arial" w:hAnsi="Arial" w:cs="Arial"/>
+          <w:b/>
+          <w:bCs/>
+          <w:i w:val="0"/>
+          <w:iCs w:val="0"/>
+          <w:sz w:val="24"/>
+          <w:szCs w:val="24"/>
+          <w:lang w:val="pt-PT"/>
+        </w:rPr>
+        <w:t>Função repeat()</w:t>
+      </w:r>
+      <w:r>
+        <w:rPr>
+          <w:rFonts w:hint="default" w:ascii="Arial" w:hAnsi="Arial" w:cs="Arial"/>
+          <w:b w:val="0"/>
+          <w:bCs w:val="0"/>
+          <w:i w:val="0"/>
+          <w:iCs w:val="0"/>
+          <w:sz w:val="24"/>
+          <w:szCs w:val="24"/>
+          <w:lang w:val="pt-PT"/>
+        </w:rPr>
+        <w:t xml:space="preserve"> - uma fução para repetir um padrão de colunas ou linhas de forma concisa.</w:t>
+      </w:r>
+    </w:p>
+    <w:p>
+      <w:pPr>
+        <w:keepNext w:val="0"/>
+        <w:keepLines w:val="0"/>
+        <w:widowControl/>
+        <w:numPr>
+          <w:numId w:val="0"/>
+        </w:numPr>
+        <w:suppressLineNumbers w:val="0"/>
+        <w:spacing w:line="360" w:lineRule="auto"/>
+        <w:ind w:left="720" w:leftChars="0"/>
+        <w:jc w:val="left"/>
+        <w:rPr>
+          <w:rFonts w:hint="default" w:ascii="Arial" w:hAnsi="Arial" w:cs="Arial"/>
+          <w:b w:val="0"/>
+          <w:bCs w:val="0"/>
+          <w:i w:val="0"/>
+          <w:iCs w:val="0"/>
+          <w:sz w:val="24"/>
+          <w:szCs w:val="24"/>
+          <w:lang w:val="pt-PT"/>
+        </w:rPr>
+      </w:pPr>
+      <w:r>
+        <w:rPr>
+          <w:rFonts w:hint="default" w:ascii="Arial" w:hAnsi="Arial" w:cs="Arial"/>
+          <w:b/>
+          <w:bCs/>
+          <w:i w:val="0"/>
+          <w:iCs w:val="0"/>
+          <w:sz w:val="24"/>
+          <w:szCs w:val="24"/>
+          <w:lang w:val="pt-PT"/>
+        </w:rPr>
+        <w:t>Ex:</w:t>
+      </w:r>
+      <w:r>
+        <w:rPr>
+          <w:rFonts w:hint="default" w:ascii="Arial" w:hAnsi="Arial" w:cs="Arial"/>
+          <w:b w:val="0"/>
+          <w:bCs w:val="0"/>
+          <w:i w:val="0"/>
+          <w:iCs w:val="0"/>
+          <w:sz w:val="24"/>
+          <w:szCs w:val="24"/>
+          <w:lang w:val="pt-PT"/>
+        </w:rPr>
+        <w:t xml:space="preserve"> grid-template-row: auto 100px 1fr repeat(2, 50px</w:t>
+      </w:r>
+      <w:bookmarkStart w:id="0" w:name="_GoBack"/>
+      <w:bookmarkEnd w:id="0"/>
+      <w:r>
+        <w:rPr>
+          <w:rFonts w:hint="default" w:ascii="Arial" w:hAnsi="Arial" w:cs="Arial"/>
+          <w:b w:val="0"/>
+          <w:bCs w:val="0"/>
+          <w:i w:val="0"/>
+          <w:iCs w:val="0"/>
+          <w:sz w:val="24"/>
+          <w:szCs w:val="24"/>
+          <w:lang w:val="pt-PT"/>
+        </w:rPr>
+        <w:t>);</w:t>
+      </w:r>
+    </w:p>
+    <w:p>
+      <w:pPr>
+        <w:keepNext w:val="0"/>
+        <w:keepLines w:val="0"/>
+        <w:widowControl/>
+        <w:numPr>
+          <w:numId w:val="0"/>
+        </w:numPr>
+        <w:suppressLineNumbers w:val="0"/>
+        <w:spacing w:line="360" w:lineRule="auto"/>
+        <w:jc w:val="left"/>
+        <w:rPr>
+          <w:rFonts w:hint="default" w:ascii="Arial" w:hAnsi="Arial" w:cs="Arial"/>
+          <w:b w:val="0"/>
+          <w:bCs w:val="0"/>
+          <w:i w:val="0"/>
+          <w:iCs w:val="0"/>
+          <w:sz w:val="24"/>
+          <w:szCs w:val="24"/>
+          <w:lang w:val="pt-PT"/>
+        </w:rPr>
+      </w:pPr>
     </w:p>
     <w:sectPr>
       <w:pgSz w:w="11906" w:h="16838"/>
@@ -4941,6 +6190,28 @@
 <file path=word/numbering.xml><?xml version="1.0" encoding="utf-8"?>
 <w:numbering xmlns:wpc="http://schemas.microsoft.com/office/word/2010/wordprocessingCanvas" xmlns:mc="http://schemas.openxmlformats.org/markup-compatibility/2006" xmlns:o="urn:schemas-microsoft-com:office:office" xmlns:r="http://schemas.openxmlformats.org/officeDocument/2006/relationships" xmlns:m="http://schemas.openxmlformats.org/officeDocument/2006/math" xmlns:v="urn:schemas-microsoft-com:vml" xmlns:wp14="http://schemas.microsoft.com/office/word/2010/wordprocessingDrawing" xmlns:wp="http://schemas.openxmlformats.org/drawingml/2006/wordprocessingDrawing" xmlns:w10="urn:schemas-microsoft-com:office:word" xmlns:w="http://schemas.openxmlformats.org/wordprocessingml/2006/main" xmlns:w14="http://schemas.microsoft.com/office/word/2010/wordml" xmlns:wpg="http://schemas.microsoft.com/office/word/2010/wordprocessingGroup" xmlns:wpi="http://schemas.microsoft.com/office/word/2010/wordprocessingInk" xmlns:wne="http://schemas.microsoft.com/office/word/2006/wordml" xmlns:wps="http://schemas.microsoft.com/office/word/2010/wordprocessingShape" xmlns:wpsCustomData="http://www.wps.cn/officeDocument/2013/wpsCustomData" mc:Ignorable="w14 wp14">
   <w:abstractNum w:abstractNumId="0">
+    <w:nsid w:val="9F67ACEB"/>
+    <w:multiLevelType w:val="singleLevel"/>
+    <w:tmpl w:val="9F67ACEB"/>
+    <w:lvl w:ilvl="0" w:tentative="0">
+      <w:start w:val="1"/>
+      <w:numFmt w:val="lowerLetter"/>
+      <w:lvlText w:val="%1."/>
+      <w:lvlJc w:val="left"/>
+      <w:pPr>
+        <w:tabs>
+          <w:tab w:val="left" w:pos="845"/>
+        </w:tabs>
+        <w:ind w:left="845" w:leftChars="0" w:hanging="425" w:firstLineChars="0"/>
+      </w:pPr>
+      <w:rPr>
+        <w:rFonts w:hint="default" w:ascii="Arial" w:hAnsi="Arial" w:cs="Arial"/>
+        <w:b/>
+        <w:bCs/>
+      </w:rPr>
+    </w:lvl>
+  </w:abstractNum>
+  <w:abstractNum w:abstractNumId="1">
     <w:nsid w:val="AEDBE0C3"/>
     <w:multiLevelType w:val="singleLevel"/>
     <w:tmpl w:val="AEDBE0C3"/>
@@ -4962,7 +6233,7 @@
       </w:rPr>
     </w:lvl>
   </w:abstractNum>
-  <w:abstractNum w:abstractNumId="1">
+  <w:abstractNum w:abstractNumId="2">
     <w:nsid w:val="B339F775"/>
     <w:multiLevelType w:val="singleLevel"/>
     <w:tmpl w:val="B339F775"/>
@@ -4982,7 +6253,29 @@
       </w:rPr>
     </w:lvl>
   </w:abstractNum>
-  <w:abstractNum w:abstractNumId="2">
+  <w:abstractNum w:abstractNumId="3">
+    <w:nsid w:val="B3EF2521"/>
+    <w:multiLevelType w:val="singleLevel"/>
+    <w:tmpl w:val="B3EF2521"/>
+    <w:lvl w:ilvl="0" w:tentative="0">
+      <w:start w:val="1"/>
+      <w:numFmt w:val="lowerLetter"/>
+      <w:lvlText w:val="%1."/>
+      <w:lvlJc w:val="left"/>
+      <w:pPr>
+        <w:tabs>
+          <w:tab w:val="left" w:pos="845"/>
+        </w:tabs>
+        <w:ind w:left="845" w:leftChars="0" w:hanging="425" w:firstLineChars="0"/>
+      </w:pPr>
+      <w:rPr>
+        <w:rFonts w:hint="default" w:ascii="Arial" w:hAnsi="Arial" w:cs="Arial"/>
+        <w:b/>
+        <w:bCs/>
+      </w:rPr>
+    </w:lvl>
+  </w:abstractNum>
+  <w:abstractNum w:abstractNumId="4">
     <w:nsid w:val="B77FF459"/>
     <w:multiLevelType w:val="singleLevel"/>
     <w:tmpl w:val="B77FF459"/>
@@ -5002,7 +6295,7 @@
       </w:rPr>
     </w:lvl>
   </w:abstractNum>
-  <w:abstractNum w:abstractNumId="3">
+  <w:abstractNum w:abstractNumId="5">
     <w:nsid w:val="BFAEC334"/>
     <w:multiLevelType w:val="singleLevel"/>
     <w:tmpl w:val="BFAEC334"/>
@@ -5026,7 +6319,7 @@
       </w:rPr>
     </w:lvl>
   </w:abstractNum>
-  <w:abstractNum w:abstractNumId="4">
+  <w:abstractNum w:abstractNumId="6">
     <w:nsid w:val="CFFE03E7"/>
     <w:multiLevelType w:val="singleLevel"/>
     <w:tmpl w:val="CFFE03E7"/>
@@ -5046,7 +6339,7 @@
       </w:rPr>
     </w:lvl>
   </w:abstractNum>
-  <w:abstractNum w:abstractNumId="5">
+  <w:abstractNum w:abstractNumId="7">
     <w:nsid w:val="D7AE1C4B"/>
     <w:multiLevelType w:val="singleLevel"/>
     <w:tmpl w:val="D7AE1C4B"/>
@@ -5066,7 +6359,7 @@
       </w:rPr>
     </w:lvl>
   </w:abstractNum>
-  <w:abstractNum w:abstractNumId="6">
+  <w:abstractNum w:abstractNumId="8">
     <w:nsid w:val="DDFE11B8"/>
     <w:multiLevelType w:val="singleLevel"/>
     <w:tmpl w:val="DDFE11B8"/>
@@ -5088,7 +6381,7 @@
       </w:rPr>
     </w:lvl>
   </w:abstractNum>
-  <w:abstractNum w:abstractNumId="7">
+  <w:abstractNum w:abstractNumId="9">
     <w:nsid w:val="DEEC18CA"/>
     <w:multiLevelType w:val="singleLevel"/>
     <w:tmpl w:val="DEEC18CA"/>
@@ -5108,7 +6401,27 @@
       </w:rPr>
     </w:lvl>
   </w:abstractNum>
-  <w:abstractNum w:abstractNumId="8">
+  <w:abstractNum w:abstractNumId="10">
+    <w:nsid w:val="DEFE3E69"/>
+    <w:multiLevelType w:val="singleLevel"/>
+    <w:tmpl w:val="DEFE3E69"/>
+    <w:lvl w:ilvl="0" w:tentative="0">
+      <w:start w:val="1"/>
+      <w:numFmt w:val="bullet"/>
+      <w:lvlText w:val=""/>
+      <w:lvlJc w:val="left"/>
+      <w:pPr>
+        <w:tabs>
+          <w:tab w:val="left" w:pos="840"/>
+        </w:tabs>
+        <w:ind w:left="840" w:leftChars="0" w:hanging="420" w:firstLineChars="0"/>
+      </w:pPr>
+      <w:rPr>
+        <w:rFonts w:hint="default" w:ascii="Wingdings" w:hAnsi="Wingdings"/>
+      </w:rPr>
+    </w:lvl>
+  </w:abstractNum>
+  <w:abstractNum w:abstractNumId="11">
     <w:nsid w:val="DFFFBA42"/>
     <w:multiLevelType w:val="singleLevel"/>
     <w:tmpl w:val="DFFFBA42"/>
@@ -5128,7 +6441,7 @@
       </w:rPr>
     </w:lvl>
   </w:abstractNum>
-  <w:abstractNum w:abstractNumId="9">
+  <w:abstractNum w:abstractNumId="12">
     <w:nsid w:val="EDBFEFB6"/>
     <w:multiLevelType w:val="singleLevel"/>
     <w:tmpl w:val="EDBFEFB6"/>
@@ -5150,7 +6463,29 @@
       </w:rPr>
     </w:lvl>
   </w:abstractNum>
-  <w:abstractNum w:abstractNumId="10">
+  <w:abstractNum w:abstractNumId="13">
+    <w:nsid w:val="F79FF75C"/>
+    <w:multiLevelType w:val="singleLevel"/>
+    <w:tmpl w:val="F79FF75C"/>
+    <w:lvl w:ilvl="0" w:tentative="0">
+      <w:start w:val="1"/>
+      <w:numFmt w:val="decimal"/>
+      <w:lvlText w:val="%1."/>
+      <w:lvlJc w:val="left"/>
+      <w:pPr>
+        <w:tabs>
+          <w:tab w:val="left" w:pos="425"/>
+        </w:tabs>
+        <w:ind w:left="425" w:leftChars="0" w:hanging="425" w:firstLineChars="0"/>
+      </w:pPr>
+      <w:rPr>
+        <w:rFonts w:hint="default"/>
+        <w:b/>
+        <w:bCs/>
+      </w:rPr>
+    </w:lvl>
+  </w:abstractNum>
+  <w:abstractNum w:abstractNumId="14">
     <w:nsid w:val="F7D6F7B8"/>
     <w:multiLevelType w:val="singleLevel"/>
     <w:tmpl w:val="F7D6F7B8"/>
@@ -5170,7 +6505,7 @@
       </w:rPr>
     </w:lvl>
   </w:abstractNum>
-  <w:abstractNum w:abstractNumId="11">
+  <w:abstractNum w:abstractNumId="15">
     <w:nsid w:val="F7EF2025"/>
     <w:multiLevelType w:val="singleLevel"/>
     <w:tmpl w:val="F7EF2025"/>
@@ -5190,7 +6525,7 @@
       </w:rPr>
     </w:lvl>
   </w:abstractNum>
-  <w:abstractNum w:abstractNumId="12">
+  <w:abstractNum w:abstractNumId="16">
     <w:nsid w:val="F7EFB4DA"/>
     <w:multiLevelType w:val="singleLevel"/>
     <w:tmpl w:val="F7EFB4DA"/>
@@ -5212,7 +6547,7 @@
       </w:rPr>
     </w:lvl>
   </w:abstractNum>
-  <w:abstractNum w:abstractNumId="13">
+  <w:abstractNum w:abstractNumId="17">
     <w:nsid w:val="F8F27758"/>
     <w:multiLevelType w:val="singleLevel"/>
     <w:tmpl w:val="F8F27758"/>
@@ -5236,7 +6571,7 @@
       </w:rPr>
     </w:lvl>
   </w:abstractNum>
-  <w:abstractNum w:abstractNumId="14">
+  <w:abstractNum w:abstractNumId="18">
     <w:nsid w:val="FDEFEB24"/>
     <w:multiLevelType w:val="singleLevel"/>
     <w:tmpl w:val="FDEFEB24"/>
@@ -5256,7 +6591,7 @@
       </w:rPr>
     </w:lvl>
   </w:abstractNum>
-  <w:abstractNum w:abstractNumId="15">
+  <w:abstractNum w:abstractNumId="19">
     <w:nsid w:val="FDFC535F"/>
     <w:multiLevelType w:val="singleLevel"/>
     <w:tmpl w:val="FDFC535F"/>
@@ -5278,7 +6613,7 @@
       </w:rPr>
     </w:lvl>
   </w:abstractNum>
-  <w:abstractNum w:abstractNumId="16">
+  <w:abstractNum w:abstractNumId="20">
     <w:nsid w:val="FFB60D88"/>
     <w:multiLevelType w:val="singleLevel"/>
     <w:tmpl w:val="FFB60D88"/>
@@ -5298,7 +6633,7 @@
       </w:rPr>
     </w:lvl>
   </w:abstractNum>
-  <w:abstractNum w:abstractNumId="17">
+  <w:abstractNum w:abstractNumId="21">
     <w:nsid w:val="FFEF3227"/>
     <w:multiLevelType w:val="singleLevel"/>
     <w:tmpl w:val="FFEF3227"/>
@@ -5318,7 +6653,7 @@
       </w:rPr>
     </w:lvl>
   </w:abstractNum>
-  <w:abstractNum w:abstractNumId="18">
+  <w:abstractNum w:abstractNumId="22">
     <w:nsid w:val="FFFB7F12"/>
     <w:multiLevelType w:val="singleLevel"/>
     <w:tmpl w:val="FFFB7F12"/>
@@ -5340,7 +6675,7 @@
       </w:rPr>
     </w:lvl>
   </w:abstractNum>
-  <w:abstractNum w:abstractNumId="19">
+  <w:abstractNum w:abstractNumId="23">
     <w:nsid w:val="FFFF724C"/>
     <w:multiLevelType w:val="singleLevel"/>
     <w:tmpl w:val="FFFF724C"/>
@@ -5360,7 +6695,7 @@
       </w:rPr>
     </w:lvl>
   </w:abstractNum>
-  <w:abstractNum w:abstractNumId="20">
+  <w:abstractNum w:abstractNumId="24">
     <w:nsid w:val="6D7A5862"/>
     <w:multiLevelType w:val="singleLevel"/>
     <w:tmpl w:val="6D7A5862"/>
@@ -5380,7 +6715,49 @@
       </w:rPr>
     </w:lvl>
   </w:abstractNum>
-  <w:abstractNum w:abstractNumId="21">
+  <w:abstractNum w:abstractNumId="25">
+    <w:nsid w:val="6F37BA11"/>
+    <w:multiLevelType w:val="singleLevel"/>
+    <w:tmpl w:val="6F37BA11"/>
+    <w:lvl w:ilvl="0" w:tentative="0">
+      <w:start w:val="1"/>
+      <w:numFmt w:val="bullet"/>
+      <w:lvlText w:val=""/>
+      <w:lvlJc w:val="left"/>
+      <w:pPr>
+        <w:tabs>
+          <w:tab w:val="left" w:pos="420"/>
+        </w:tabs>
+        <w:ind w:left="420" w:leftChars="0" w:hanging="420" w:firstLineChars="0"/>
+      </w:pPr>
+      <w:rPr>
+        <w:rFonts w:hint="default" w:ascii="Wingdings" w:hAnsi="Wingdings"/>
+      </w:rPr>
+    </w:lvl>
+  </w:abstractNum>
+  <w:abstractNum w:abstractNumId="26">
+    <w:nsid w:val="6FDFCF4B"/>
+    <w:multiLevelType w:val="singleLevel"/>
+    <w:tmpl w:val="6FDFCF4B"/>
+    <w:lvl w:ilvl="0" w:tentative="0">
+      <w:start w:val="4"/>
+      <w:numFmt w:val="decimal"/>
+      <w:lvlText w:val="%1."/>
+      <w:lvlJc w:val="left"/>
+      <w:pPr>
+        <w:tabs>
+          <w:tab w:val="left" w:pos="432"/>
+        </w:tabs>
+        <w:ind w:left="432" w:leftChars="0" w:hanging="432" w:firstLineChars="0"/>
+      </w:pPr>
+      <w:rPr>
+        <w:rFonts w:hint="default"/>
+        <w:b/>
+        <w:bCs/>
+      </w:rPr>
+    </w:lvl>
+  </w:abstractNum>
+  <w:abstractNum w:abstractNumId="27">
     <w:nsid w:val="75BFB30A"/>
     <w:multiLevelType w:val="singleLevel"/>
     <w:tmpl w:val="75BFB30A"/>
@@ -5402,71 +6779,112 @@
       </w:rPr>
     </w:lvl>
   </w:abstractNum>
+  <w:abstractNum w:abstractNumId="28">
+    <w:nsid w:val="7656D309"/>
+    <w:multiLevelType w:val="singleLevel"/>
+    <w:tmpl w:val="7656D309"/>
+    <w:lvl w:ilvl="0" w:tentative="0">
+      <w:start w:val="1"/>
+      <w:numFmt w:val="bullet"/>
+      <w:lvlText w:val=""/>
+      <w:lvlJc w:val="left"/>
+      <w:pPr>
+        <w:tabs>
+          <w:tab w:val="left" w:pos="420"/>
+        </w:tabs>
+        <w:ind w:left="420" w:leftChars="0" w:hanging="420" w:firstLineChars="0"/>
+      </w:pPr>
+      <w:rPr>
+        <w:rFonts w:hint="default" w:ascii="Wingdings" w:hAnsi="Wingdings"/>
+      </w:rPr>
+    </w:lvl>
+  </w:abstractNum>
   <w:num w:numId="1">
+    <w:abstractNumId w:val="4"/>
+  </w:num>
+  <w:num w:numId="2">
+    <w:abstractNumId w:val="14"/>
+  </w:num>
+  <w:num w:numId="3">
+    <w:abstractNumId w:val="21"/>
+  </w:num>
+  <w:num w:numId="4">
+    <w:abstractNumId w:val="1"/>
+  </w:num>
+  <w:num w:numId="5">
+    <w:abstractNumId w:val="15"/>
+  </w:num>
+  <w:num w:numId="6">
+    <w:abstractNumId w:val="20"/>
+  </w:num>
+  <w:num w:numId="7">
     <w:abstractNumId w:val="2"/>
   </w:num>
-  <w:num w:numId="2">
+  <w:num w:numId="8">
+    <w:abstractNumId w:val="9"/>
+  </w:num>
+  <w:num w:numId="9">
+    <w:abstractNumId w:val="12"/>
+  </w:num>
+  <w:num w:numId="10">
+    <w:abstractNumId w:val="22"/>
+  </w:num>
+  <w:num w:numId="11">
+    <w:abstractNumId w:val="11"/>
+  </w:num>
+  <w:num w:numId="12">
+    <w:abstractNumId w:val="19"/>
+  </w:num>
+  <w:num w:numId="13">
+    <w:abstractNumId w:val="23"/>
+  </w:num>
+  <w:num w:numId="14">
+    <w:abstractNumId w:val="8"/>
+  </w:num>
+  <w:num w:numId="15">
+    <w:abstractNumId w:val="6"/>
+  </w:num>
+  <w:num w:numId="16">
+    <w:abstractNumId w:val="5"/>
+  </w:num>
+  <w:num w:numId="17">
+    <w:abstractNumId w:val="7"/>
+  </w:num>
+  <w:num w:numId="18">
+    <w:abstractNumId w:val="17"/>
+  </w:num>
+  <w:num w:numId="19">
+    <w:abstractNumId w:val="24"/>
+  </w:num>
+  <w:num w:numId="20">
+    <w:abstractNumId w:val="27"/>
+  </w:num>
+  <w:num w:numId="21">
+    <w:abstractNumId w:val="18"/>
+  </w:num>
+  <w:num w:numId="22">
+    <w:abstractNumId w:val="16"/>
+  </w:num>
+  <w:num w:numId="23">
+    <w:abstractNumId w:val="13"/>
+  </w:num>
+  <w:num w:numId="24">
     <w:abstractNumId w:val="10"/>
   </w:num>
-  <w:num w:numId="3">
-    <w:abstractNumId w:val="17"/>
+  <w:num w:numId="25">
+    <w:abstractNumId w:val="26"/>
   </w:num>
-  <w:num w:numId="4">
+  <w:num w:numId="26">
+    <w:abstractNumId w:val="25"/>
+  </w:num>
+  <w:num w:numId="27">
     <w:abstractNumId w:val="0"/>
   </w:num>
-  <w:num w:numId="5">
-    <w:abstractNumId w:val="11"/>
+  <w:num w:numId="28">
+    <w:abstractNumId w:val="28"/>
   </w:num>
-  <w:num w:numId="6">
-    <w:abstractNumId w:val="16"/>
-  </w:num>
-  <w:num w:numId="7">
-    <w:abstractNumId w:val="1"/>
-  </w:num>
-  <w:num w:numId="8">
-    <w:abstractNumId w:val="7"/>
-  </w:num>
-  <w:num w:numId="9">
-    <w:abstractNumId w:val="9"/>
-  </w:num>
-  <w:num w:numId="10">
-    <w:abstractNumId w:val="18"/>
-  </w:num>
-  <w:num w:numId="11">
-    <w:abstractNumId w:val="8"/>
-  </w:num>
-  <w:num w:numId="12">
-    <w:abstractNumId w:val="15"/>
-  </w:num>
-  <w:num w:numId="13">
-    <w:abstractNumId w:val="19"/>
-  </w:num>
-  <w:num w:numId="14">
-    <w:abstractNumId w:val="6"/>
-  </w:num>
-  <w:num w:numId="15">
-    <w:abstractNumId w:val="4"/>
-  </w:num>
-  <w:num w:numId="16">
+  <w:num w:numId="29">
     <w:abstractNumId w:val="3"/>
-  </w:num>
-  <w:num w:numId="17">
-    <w:abstractNumId w:val="5"/>
-  </w:num>
-  <w:num w:numId="18">
-    <w:abstractNumId w:val="13"/>
-  </w:num>
-  <w:num w:numId="19">
-    <w:abstractNumId w:val="20"/>
-  </w:num>
-  <w:num w:numId="20">
-    <w:abstractNumId w:val="21"/>
-  </w:num>
-  <w:num w:numId="21">
-    <w:abstractNumId w:val="14"/>
-  </w:num>
-  <w:num w:numId="22">
-    <w:abstractNumId w:val="12"/>
   </w:num>
 </w:numbering>
 </file>
@@ -5574,11 +6992,11 @@
     <w:lsdException w:unhideWhenUsed="0" w:uiPriority="0" w:semiHidden="0" w:name="Document Map"/>
     <w:lsdException w:unhideWhenUsed="0" w:uiPriority="0" w:semiHidden="0" w:name="Plain Text"/>
     <w:lsdException w:unhideWhenUsed="0" w:uiPriority="0" w:semiHidden="0" w:name="E-mail Signature"/>
-    <w:lsdException w:unhideWhenUsed="0" w:uiPriority="0" w:semiHidden="0" w:name="Normal (Web)"/>
+    <w:lsdException w:qFormat="1" w:unhideWhenUsed="0" w:uiPriority="0" w:semiHidden="0" w:name="Normal (Web)"/>
     <w:lsdException w:unhideWhenUsed="0" w:uiPriority="0" w:semiHidden="0" w:name="HTML Acronym"/>
     <w:lsdException w:unhideWhenUsed="0" w:uiPriority="0" w:semiHidden="0" w:name="HTML Address"/>
     <w:lsdException w:unhideWhenUsed="0" w:uiPriority="0" w:semiHidden="0" w:name="HTML Cite"/>
-    <w:lsdException w:unhideWhenUsed="0" w:uiPriority="0" w:semiHidden="0" w:name="HTML Code"/>
+    <w:lsdException w:qFormat="1" w:unhideWhenUsed="0" w:uiPriority="0" w:semiHidden="0" w:name="HTML Code"/>
     <w:lsdException w:unhideWhenUsed="0" w:uiPriority="0" w:semiHidden="0" w:name="HTML Definition"/>
     <w:lsdException w:unhideWhenUsed="0" w:uiPriority="0" w:semiHidden="0" w:name="HTML Keyboard"/>
     <w:lsdException w:unhideWhenUsed="0" w:uiPriority="0" w:semiHidden="0" w:name="HTML Preformatted"/>
@@ -5782,6 +7200,7 @@
   <w:style w:type="character" w:styleId="5">
     <w:name w:val="HTML Code"/>
     <w:basedOn w:val="3"/>
+    <w:qFormat/>
     <w:uiPriority w:val="0"/>
     <w:rPr>
       <w:rFonts w:ascii="Courier New" w:hAnsi="Courier New" w:cs="Courier New"/>
@@ -5791,6 +7210,7 @@
   </w:style>
   <w:style w:type="paragraph" w:styleId="6">
     <w:name w:val="Normal (Web)"/>
+    <w:qFormat/>
     <w:uiPriority w:val="0"/>
     <w:pPr>
       <w:spacing w:before="0" w:beforeAutospacing="1" w:after="0" w:afterAutospacing="1"/>

</xml_diff>